<commit_message>
docs: update agile schedule docs to include Sprint 1 & 2 as completed and remove PIC fields for solo dev
</commit_message>
<xml_diff>
--- a/WebAdmin/docs/Requirement/Dokumen_Perancangan_Sistem.docx
+++ b/WebAdmin/docs/Requirement/Dokumen_Perancangan_Sistem.docx
@@ -136,40 +136,54 @@
         <w:br/>
         <w:t xml:space="preserve">    PROFILES {</w:t>
         <w:br/>
-        <w:t xml:space="preserve">        uuid id PK "Relasi ke auth.users"</w:t>
+        <w:t xml:space="preserve">        uuid id PK "Relasi ke auth.users (CASCADE)"</w:t>
         <w:br/>
-        <w:t xml:space="preserve">        varchar username "Nama pengguna unik"</w:t>
+        <w:t xml:space="preserve">        text username "Nama pengguna unik"</w:t>
         <w:br/>
-        <w:t xml:space="preserve">        varchar email "Surel resmi admin"</w:t>
+        <w:t xml:space="preserve">        text email "Surel resmi admin"</w:t>
         <w:br/>
-        <w:t xml:space="preserve">        varchar role "superadmin | admin | member"</w:t>
+        <w:t xml:space="preserve">        text role "superadmin | admin | member"</w:t>
         <w:br/>
-        <w:t xml:space="preserve">        timestamp updated_at "Waktu modifikasi terakhir"</w:t>
+        <w:t xml:space="preserve">        timestamptz created_at "Waktu pembuatan profil"</w:t>
         <w:br/>
         <w:t xml:space="preserve">    }</w:t>
         <w:br/>
         <w:br/>
         <w:t xml:space="preserve">    AR_TARGETS {</w:t>
         <w:br/>
-        <w:t xml:space="preserve">        varchar id PK "ID target unik (Vuforia Marker ID)"</w:t>
+        <w:t xml:space="preserve">        text id PK "Kode unik target AR (ID Marker)"</w:t>
         <w:br/>
-        <w:t xml:space="preserve">        varchar name "Nama destinasi/lokasi"</w:t>
+        <w:t xml:space="preserve">        text nama "Nama objek/destinasi AR"</w:t>
         <w:br/>
-        <w:t xml:space="preserve">        text description "Deskripsi promosi wisata"</w:t>
+        <w:t xml:space="preserve">        text type "Kategori target (wisata, kuliner, dll.)"</w:t>
         <w:br/>
-        <w:t xml:space="preserve">        varchar main_content_type "3d_model | image_carousel | video_streaming"</w:t>
+        <w:t xml:space="preserve">        text deskripsi "Informasi detail target"</w:t>
         <w:br/>
-        <w:t xml:space="preserve">        text content_url "URL berkas aset (Supabase/GDrive)"</w:t>
+        <w:t xml:space="preserve">        numeric harga "Harga tiket/konten (opsional)"</w:t>
         <w:br/>
-        <w:t xml:space="preserve">        float scale "Multiplier skala untuk normalisasi"</w:t>
+        <w:t xml:space="preserve">        text contact_url "Tautan kontak eksternal"</w:t>
         <w:br/>
-        <w:t xml:space="preserve">        float rotation_y "Rotasi default sumbu Y"</w:t>
+        <w:t xml:space="preserve">        text marker_url "URL gambar marker"</w:t>
         <w:br/>
-        <w:t xml:space="preserve">        varchar marker_url "URL gambar marker terunggah"</w:t>
+        <w:t xml:space="preserve">        text slide_urls "Kumpulan URL galeri 2D (JSON/Text)"</w:t>
         <w:br/>
-        <w:t xml:space="preserve">        integer scan_count "Akumulasi jumlah pemindaian"</w:t>
+        <w:t xml:space="preserve">        text video_url "URL video streaming (Google Drive/direct)"</w:t>
         <w:br/>
-        <w:t xml:space="preserve">        timestamp created_at "Waktu pembuatan data"</w:t>
+        <w:t xml:space="preserve">        text glb_url "URL model 3D GLB"</w:t>
+        <w:br/>
+        <w:t xml:space="preserve">        text media_type "Jenis konten utama (image | video | glb)"</w:t>
+        <w:br/>
+        <w:t xml:space="preserve">        date start_date "Tanggal mulai aktif"</w:t>
+        <w:br/>
+        <w:t xml:space="preserve">        date end_date "Tanggal berakhir aktif"</w:t>
+        <w:br/>
+        <w:t xml:space="preserve">        text duration "Durasi target (opsional)"</w:t>
+        <w:br/>
+        <w:t xml:space="preserve">        timestamptz activity_start "Waktu mulai aktivitas"</w:t>
+        <w:br/>
+        <w:t xml:space="preserve">        timestamptz activity_end "Waktu selesai aktivitas"</w:t>
+        <w:br/>
+        <w:t xml:space="preserve">        timestamptz created_at "Waktu pembuatan data"</w:t>
         <w:br/>
         <w:t xml:space="preserve">    }</w:t>
         <w:br/>
@@ -178,22 +192,28 @@
         <w:br/>
         <w:t xml:space="preserve">        bigint id PK "Auto Increment"</w:t>
         <w:br/>
-        <w:t xml:space="preserve">        varchar target_id FK "Relasi ke ar_targets.id (CASCADE)"</w:t>
+        <w:t xml:space="preserve">        text target_id FK "Relasi ke ar_targets.id (CASCADE)"</w:t>
         <w:br/>
-        <w:t xml:space="preserve">        varchar device_info "Model HP dan OS Android"</w:t>
+        <w:t xml:space="preserve">        text device_info "Model HP dan OS Android"</w:t>
         <w:br/>
-        <w:t xml:space="preserve">        timestamp scanned_at "Waktu pemindaian dilakukan"</w:t>
+        <w:t xml:space="preserve">        timestamptz scanned_at "Waktu pemindaian dilakukan"</w:t>
         <w:br/>
         <w:t xml:space="preserve">    }</w:t>
         <w:br/>
         <w:br/>
         <w:t xml:space="preserve">    APP_SETTINGS {</w:t>
         <w:br/>
-        <w:t xml:space="preserve">        varchar key PK "Kunci konfigurasi (misal: GDRIVE_KEY)"</w:t>
+        <w:t xml:space="preserve">        text id PK "Kunci konfigurasi (default: 'current_config')"</w:t>
         <w:br/>
-        <w:t xml:space="preserve">        text value "Nilai konfigurasi (terenkripsi)"</w:t>
+        <w:t xml:space="preserve">        text supabase_url "URL endpoint Supabase"</w:t>
         <w:br/>
-        <w:t xml:space="preserve">        timestamp updated_at "Waktu update terakhir"</w:t>
+        <w:t xml:space="preserve">        text supabase_key "API key anon Supabase"</w:t>
+        <w:br/>
+        <w:t xml:space="preserve">        text gdrive_api_key "Google Drive API Key"</w:t>
+        <w:br/>
+        <w:t xml:space="preserve">        text canva_template_url "Tautan template Canva"</w:t>
+        <w:br/>
+        <w:t xml:space="preserve">        timestamptz updated_at "Waktu modifikasi terakhir"</w:t>
         <w:br/>
         <w:t xml:space="preserve">    }</w:t>
         <w:br/>
@@ -202,16 +222,26 @@
         <w:br/>
         <w:t xml:space="preserve">        bigint id PK "Auto Increment"</w:t>
         <w:br/>
-        <w:t xml:space="preserve">        uuid admin_id FK "Relasi ke profiles.id"</w:t>
+        <w:t xml:space="preserve">        text admin_email "Email admin pengubah"</w:t>
         <w:br/>
-        <w:t xml:space="preserve">        varchar action_details "Detail tindakan modifikasi"</w:t>
+        <w:t xml:space="preserve">        text old_url "Supabase URL lama"</w:t>
         <w:br/>
-        <w:t xml:space="preserve">        timestamp logged_at "Waktu pencatatan log"</w:t>
+        <w:t xml:space="preserve">        text new_url "Supabase URL baru"</w:t>
+        <w:br/>
+        <w:t xml:space="preserve">        text old_key "Supabase Key lama"</w:t>
+        <w:br/>
+        <w:t xml:space="preserve">        text new_key "Supabase Key baru"</w:t>
+        <w:br/>
+        <w:t xml:space="preserve">        text old_gdrive_key "GDrive Key lama"</w:t>
+        <w:br/>
+        <w:t xml:space="preserve">        text new_gdrive_key "GDrive Key baru"</w:t>
+        <w:br/>
+        <w:t xml:space="preserve">        timestamptz created_at "Waktu pencatatan log"</w:t>
         <w:br/>
         <w:t xml:space="preserve">    }</w:t>
         <w:br/>
         <w:br/>
-        <w:t xml:space="preserve">    PROFILES ||--o{ APP_SETTINGS_LOGS : "mencatat aktivitas"</w:t>
+        <w:t xml:space="preserve">    PROFILES ||--o{ APP_SETTINGS_LOGS : "mencatat aktivitas via email"</w:t>
         <w:br/>
         <w:t xml:space="preserve">    AR_TARGETS ||--o{ SCANS : "memiliki riwayat"</w:t>
       </w:r>

</xml_diff>